<commit_message>
Unify navigation and expand portfolio detail
</commit_message>
<xml_diff>
--- a/public/Kerk_Zhi_Sheng_Resume.docx
+++ b/public/Kerk_Zhi_Sheng_Resume.docx
@@ -147,7 +147,7 @@
     <w:p>
       <w:pPr>
         <w:keepNext/>
-        <w:spacing w:before="180" w:after="100" w:line="252" w:lineRule="auto"/>
+        <w:spacing w:before="280" w:after="140" w:line="252" w:lineRule="auto"/>
       </w:pPr>
       <w:r>
         <w:rPr>
@@ -167,7 +167,7 @@
         <w:tabs>
           <w:tab w:pos="10296" w:val="right"/>
         </w:tabs>
-        <w:spacing w:before="0" w:after="40" w:line="252" w:lineRule="auto"/>
+        <w:spacing w:before="140" w:after="60" w:line="252" w:lineRule="auto"/>
       </w:pPr>
       <w:r>
         <w:rPr>
@@ -215,7 +215,7 @@
     <w:p>
       <w:pPr>
         <w:keepNext/>
-        <w:spacing w:before="180" w:after="100" w:line="252" w:lineRule="auto"/>
+        <w:spacing w:before="280" w:after="140" w:line="252" w:lineRule="auto"/>
       </w:pPr>
       <w:r>
         <w:rPr>
@@ -225,7 +225,7 @@
           <w:sz w:val="23"/>
           <w:u w:val="single"/>
         </w:rPr>
-        <w:t>WORK EXPERIENCE</w:t>
+        <w:t>PROFESSIONAL EXPERIENCE</w:t>
       </w:r>
     </w:p>
     <w:p>
@@ -235,7 +235,7 @@
         <w:tabs>
           <w:tab w:pos="10296" w:val="right"/>
         </w:tabs>
-        <w:spacing w:before="0" w:after="40" w:line="252" w:lineRule="auto"/>
+        <w:spacing w:before="40" w:after="60" w:line="252" w:lineRule="auto"/>
       </w:pPr>
       <w:r>
         <w:rPr>
@@ -263,27 +263,101 @@
       <w:pPr>
         <w:keepNext w:val="0"/>
         <w:widowControl/>
+        <w:spacing w:before="0" w:after="100" w:line="252" w:lineRule="auto"/>
+        <w:jc w:val="both"/>
+      </w:pPr>
+      <w:r>
+        <w:rPr>
+          <w:rFonts w:ascii="Times New Roman" w:hAnsi="Times New Roman"/>
+          <w:color w:val="000000"/>
+          <w:sz w:val="22"/>
+        </w:rPr>
+        <w:t>My core scope covers data engineering across five internal projects, including dashboard development, data pipeline delivery and maintenance, optimization, and operational monitoring. I also design and ship internal AI products on top of this foundation.</w:t>
+      </w:r>
+    </w:p>
+    <w:p>
+      <w:pPr>
+        <w:keepNext/>
+        <w:widowControl/>
+        <w:spacing w:before="60" w:after="60" w:line="252" w:lineRule="auto"/>
+      </w:pPr>
+      <w:r>
+        <w:rPr>
+          <w:rFonts w:ascii="Times New Roman" w:hAnsi="Times New Roman"/>
+          <w:b/>
+          <w:color w:val="000000"/>
+          <w:sz w:val="19"/>
+        </w:rPr>
+        <w:t>CORE DATA ENGINEERING</w:t>
+      </w:r>
+    </w:p>
+    <w:p>
+      <w:pPr>
+        <w:numPr>
+          <w:ilvl w:val="0"/>
+          <w:numId w:val="4"/>
+        </w:numPr>
+        <w:keepNext w:val="0"/>
+        <w:widowControl/>
         <w:spacing w:before="0" w:after="80" w:line="252" w:lineRule="auto"/>
-        <w:jc w:val="both"/>
-      </w:pPr>
-      <w:r>
-        <w:rPr>
-          <w:rFonts w:ascii="Times New Roman" w:hAnsi="Times New Roman"/>
-          <w:color w:val="000000"/>
-          <w:sz w:val="22"/>
-        </w:rPr>
-        <w:t>I design and ship internal AI products from the data model through to the operating workflow. Two applications are in production today, with more progressing through user acceptance testing.</w:t>
-      </w:r>
-    </w:p>
-    <w:p>
-      <w:pPr>
-        <w:numPr>
-          <w:ilvl w:val="0"/>
-          <w:numId w:val="4"/>
-        </w:numPr>
-        <w:keepNext w:val="0"/>
-        <w:widowControl/>
-        <w:spacing w:before="0" w:after="70" w:line="252" w:lineRule="auto"/>
+        <w:ind w:left="360" w:hanging="360"/>
+        <w:jc w:val="left"/>
+      </w:pPr>
+      <w:r>
+        <w:rPr>
+          <w:rFonts w:ascii="Times New Roman" w:hAnsi="Times New Roman"/>
+          <w:color w:val="000000"/>
+          <w:sz w:val="22"/>
+        </w:rPr>
+        <w:t>Worked across five internal projects, developing operational dashboards and building, maintaining, and improving data pipelines used by internal teams.</w:t>
+      </w:r>
+    </w:p>
+    <w:p>
+      <w:pPr>
+        <w:numPr>
+          <w:ilvl w:val="0"/>
+          <w:numId w:val="4"/>
+        </w:numPr>
+        <w:keepNext w:val="0"/>
+        <w:widowControl/>
+        <w:spacing w:before="0" w:after="80" w:line="252" w:lineRule="auto"/>
+        <w:ind w:left="360" w:hanging="360"/>
+        <w:jc w:val="left"/>
+      </w:pPr>
+      <w:r>
+        <w:rPr>
+          <w:rFonts w:ascii="Times New Roman" w:hAnsi="Times New Roman"/>
+          <w:color w:val="000000"/>
+          <w:sz w:val="22"/>
+        </w:rPr>
+        <w:t>Developed optimization and monitoring solutions, including pipeline skip detection and volume analysis to surface skipped runs and unexpected processing patterns.</w:t>
+      </w:r>
+    </w:p>
+    <w:p>
+      <w:pPr>
+        <w:keepNext/>
+        <w:widowControl/>
+        <w:spacing w:before="100" w:after="60" w:line="252" w:lineRule="auto"/>
+      </w:pPr>
+      <w:r>
+        <w:rPr>
+          <w:rFonts w:ascii="Times New Roman" w:hAnsi="Times New Roman"/>
+          <w:b/>
+          <w:color w:val="000000"/>
+          <w:sz w:val="19"/>
+        </w:rPr>
+        <w:t>AI PRODUCT ENGINEERING</w:t>
+      </w:r>
+    </w:p>
+    <w:p>
+      <w:pPr>
+        <w:numPr>
+          <w:ilvl w:val="0"/>
+          <w:numId w:val="4"/>
+        </w:numPr>
+        <w:keepNext w:val="0"/>
+        <w:widowControl/>
+        <w:spacing w:before="0" w:after="80" w:line="252" w:lineRule="auto"/>
         <w:ind w:left="360" w:hanging="360"/>
         <w:jc w:val="left"/>
       </w:pPr>
@@ -304,7 +378,7 @@
         </w:numPr>
         <w:keepNext w:val="0"/>
         <w:widowControl/>
-        <w:spacing w:before="0" w:after="70" w:line="252" w:lineRule="auto"/>
+        <w:spacing w:before="0" w:after="80" w:line="252" w:lineRule="auto"/>
         <w:ind w:left="360" w:hanging="360"/>
         <w:jc w:val="left"/>
       </w:pPr>
@@ -325,49 +399,65 @@
         </w:numPr>
         <w:keepNext w:val="0"/>
         <w:widowControl/>
-        <w:spacing w:before="0" w:after="70" w:line="252" w:lineRule="auto"/>
-        <w:ind w:left="360" w:hanging="360"/>
-        <w:jc w:val="left"/>
-      </w:pPr>
-      <w:r>
-        <w:rPr>
-          <w:rFonts w:ascii="Times New Roman" w:hAnsi="Times New Roman"/>
-          <w:color w:val="000000"/>
-          <w:sz w:val="22"/>
-        </w:rPr>
-        <w:t>Applied data engineering principles to production readiness through intentional schemas, dependable persistence, traceable agent decisions, and maintainable integration boundaries.</w:t>
-      </w:r>
-    </w:p>
-    <w:p>
-      <w:pPr>
-        <w:numPr>
-          <w:ilvl w:val="0"/>
-          <w:numId w:val="4"/>
-        </w:numPr>
-        <w:keepNext w:val="0"/>
-        <w:widowControl/>
-        <w:spacing w:before="0" w:after="70" w:line="252" w:lineRule="auto"/>
-        <w:ind w:left="360" w:hanging="360"/>
-        <w:jc w:val="left"/>
-      </w:pPr>
-      <w:r>
-        <w:rPr>
-          <w:rFonts w:ascii="Times New Roman" w:hAnsi="Times New Roman"/>
-          <w:color w:val="000000"/>
-          <w:sz w:val="22"/>
-        </w:rPr>
-        <w:t>Developed an internal real-time pose-detection engine with MediaPipe, together with operational dashboards and Databricks pipelines for production workflows.</w:t>
-      </w:r>
-    </w:p>
-    <w:p>
-      <w:pPr>
-        <w:numPr>
-          <w:ilvl w:val="0"/>
-          <w:numId w:val="4"/>
-        </w:numPr>
-        <w:keepNext w:val="0"/>
-        <w:widowControl/>
-        <w:spacing w:before="0" w:after="70" w:line="252" w:lineRule="auto"/>
+        <w:spacing w:before="0" w:after="80" w:line="252" w:lineRule="auto"/>
+        <w:ind w:left="360" w:hanging="360"/>
+        <w:jc w:val="left"/>
+      </w:pPr>
+      <w:r>
+        <w:rPr>
+          <w:rFonts w:ascii="Times New Roman" w:hAnsi="Times New Roman"/>
+          <w:color w:val="000000"/>
+          <w:sz w:val="22"/>
+        </w:rPr>
+        <w:t>Applied data engineering principles to AI production readiness through intentional schemas, dependable persistence, traceable agent decisions, and maintainable integration boundaries.</w:t>
+      </w:r>
+    </w:p>
+    <w:p>
+      <w:pPr>
+        <w:numPr>
+          <w:ilvl w:val="0"/>
+          <w:numId w:val="4"/>
+        </w:numPr>
+        <w:keepNext w:val="0"/>
+        <w:widowControl/>
+        <w:spacing w:before="0" w:after="80" w:line="252" w:lineRule="auto"/>
+        <w:ind w:left="360" w:hanging="360"/>
+        <w:jc w:val="left"/>
+      </w:pPr>
+      <w:r>
+        <w:rPr>
+          <w:rFonts w:ascii="Times New Roman" w:hAnsi="Times New Roman"/>
+          <w:color w:val="000000"/>
+          <w:sz w:val="22"/>
+        </w:rPr>
+        <w:t>Developed an internal real-time pose-detection engine with MediaPipe for an internal workflow.</w:t>
+      </w:r>
+    </w:p>
+    <w:p>
+      <w:pPr>
+        <w:keepNext/>
+        <w:widowControl/>
+        <w:spacing w:before="100" w:after="60" w:line="252" w:lineRule="auto"/>
+      </w:pPr>
+      <w:r>
+        <w:rPr>
+          <w:rFonts w:ascii="Times New Roman" w:hAnsi="Times New Roman"/>
+          <w:b/>
+          <w:color w:val="000000"/>
+          <w:sz w:val="19"/>
+        </w:rPr>
+        <w:t>INTERNAL KNOWLEDGE SHARING</w:t>
+      </w:r>
+    </w:p>
+    <w:p>
+      <w:pPr>
+        <w:numPr>
+          <w:ilvl w:val="0"/>
+          <w:numId w:val="4"/>
+        </w:numPr>
+        <w:keepNext w:val="0"/>
+        <w:widowControl/>
+        <w:spacing w:before="0" w:after="100" w:line="252" w:lineRule="auto"/>
         <w:ind w:left="360" w:hanging="360"/>
         <w:jc w:val="left"/>
       </w:pPr>
@@ -387,7 +477,7 @@
         <w:tabs>
           <w:tab w:pos="10296" w:val="right"/>
         </w:tabs>
-        <w:spacing w:before="0" w:after="40" w:line="252" w:lineRule="auto"/>
+        <w:spacing w:before="220" w:after="60" w:line="252" w:lineRule="auto"/>
       </w:pPr>
       <w:r>
         <w:rPr>
@@ -413,13 +503,29 @@
     </w:p>
     <w:p>
       <w:pPr>
-        <w:numPr>
-          <w:ilvl w:val="0"/>
-          <w:numId w:val="4"/>
-        </w:numPr>
-        <w:keepNext w:val="0"/>
-        <w:widowControl/>
-        <w:spacing w:before="0" w:after="70" w:line="252" w:lineRule="auto"/>
+        <w:keepNext/>
+        <w:widowControl/>
+        <w:spacing w:before="60" w:after="60" w:line="252" w:lineRule="auto"/>
+      </w:pPr>
+      <w:r>
+        <w:rPr>
+          <w:rFonts w:ascii="Times New Roman" w:hAnsi="Times New Roman"/>
+          <w:b/>
+          <w:color w:val="000000"/>
+          <w:sz w:val="19"/>
+        </w:rPr>
+        <w:t>OPTIMIZATION AND PLANNING</w:t>
+      </w:r>
+    </w:p>
+    <w:p>
+      <w:pPr>
+        <w:numPr>
+          <w:ilvl w:val="0"/>
+          <w:numId w:val="4"/>
+        </w:numPr>
+        <w:keepNext w:val="0"/>
+        <w:widowControl/>
+        <w:spacing w:before="0" w:after="80" w:line="252" w:lineRule="auto"/>
         <w:ind w:left="360" w:hanging="360"/>
         <w:jc w:val="left"/>
       </w:pPr>
@@ -440,7 +546,44 @@
         </w:numPr>
         <w:keepNext w:val="0"/>
         <w:widowControl/>
-        <w:spacing w:before="0" w:after="70" w:line="252" w:lineRule="auto"/>
+        <w:spacing w:before="0" w:after="80" w:line="252" w:lineRule="auto"/>
+        <w:ind w:left="360" w:hanging="360"/>
+        <w:jc w:val="left"/>
+      </w:pPr>
+      <w:r>
+        <w:rPr>
+          <w:rFonts w:ascii="Times New Roman" w:hAnsi="Times New Roman"/>
+          <w:color w:val="000000"/>
+          <w:sz w:val="22"/>
+        </w:rPr>
+        <w:t>Directed equipment performance-to-model tracking and coordinated data engineers building reliable sources for model-accuracy analysis.</w:t>
+      </w:r>
+    </w:p>
+    <w:p>
+      <w:pPr>
+        <w:keepNext/>
+        <w:widowControl/>
+        <w:spacing w:before="100" w:after="60" w:line="252" w:lineRule="auto"/>
+      </w:pPr>
+      <w:r>
+        <w:rPr>
+          <w:rFonts w:ascii="Times New Roman" w:hAnsi="Times New Roman"/>
+          <w:b/>
+          <w:color w:val="000000"/>
+          <w:sz w:val="19"/>
+        </w:rPr>
+        <w:t>DATA PLATFORMS AND AUTOMATION</w:t>
+      </w:r>
+    </w:p>
+    <w:p>
+      <w:pPr>
+        <w:numPr>
+          <w:ilvl w:val="0"/>
+          <w:numId w:val="4"/>
+        </w:numPr>
+        <w:keepNext w:val="0"/>
+        <w:widowControl/>
+        <w:spacing w:before="0" w:after="80" w:line="252" w:lineRule="auto"/>
         <w:ind w:left="360" w:hanging="360"/>
         <w:jc w:val="left"/>
       </w:pPr>
@@ -461,7 +604,7 @@
         </w:numPr>
         <w:keepNext w:val="0"/>
         <w:widowControl/>
-        <w:spacing w:before="0" w:after="70" w:line="252" w:lineRule="auto"/>
+        <w:spacing w:before="0" w:after="80" w:line="252" w:lineRule="auto"/>
         <w:ind w:left="360" w:hanging="360"/>
         <w:jc w:val="left"/>
       </w:pPr>
@@ -482,7 +625,7 @@
         </w:numPr>
         <w:keepNext w:val="0"/>
         <w:widowControl/>
-        <w:spacing w:before="0" w:after="70" w:line="252" w:lineRule="auto"/>
+        <w:spacing w:before="0" w:after="80" w:line="252" w:lineRule="auto"/>
         <w:ind w:left="360" w:hanging="360"/>
         <w:jc w:val="left"/>
       </w:pPr>
@@ -493,27 +636,6 @@
           <w:sz w:val="22"/>
         </w:rPr>
         <w:t>Scaled product-assembly re-entrance reporting across product groups, contributing a further 20 hours of weekly time savings.</w:t>
-      </w:r>
-    </w:p>
-    <w:p>
-      <w:pPr>
-        <w:numPr>
-          <w:ilvl w:val="0"/>
-          <w:numId w:val="4"/>
-        </w:numPr>
-        <w:keepNext w:val="0"/>
-        <w:widowControl/>
-        <w:spacing w:before="0" w:after="70" w:line="252" w:lineRule="auto"/>
-        <w:ind w:left="360" w:hanging="360"/>
-        <w:jc w:val="left"/>
-      </w:pPr>
-      <w:r>
-        <w:rPr>
-          <w:rFonts w:ascii="Times New Roman" w:hAnsi="Times New Roman"/>
-          <w:color w:val="000000"/>
-          <w:sz w:val="22"/>
-        </w:rPr>
-        <w:t>Directed equipment performance-to-model tracking and coordinated data engineers building reliable sources for model-accuracy analysis.</w:t>
       </w:r>
     </w:p>
     <w:p>
@@ -523,7 +645,7 @@
         <w:tabs>
           <w:tab w:pos="10296" w:val="right"/>
         </w:tabs>
-        <w:spacing w:before="0" w:after="40" w:line="252" w:lineRule="auto"/>
+        <w:spacing w:before="220" w:after="60" w:line="252" w:lineRule="auto"/>
       </w:pPr>
       <w:r>
         <w:rPr>
@@ -549,13 +671,29 @@
     </w:p>
     <w:p>
       <w:pPr>
-        <w:numPr>
-          <w:ilvl w:val="0"/>
-          <w:numId w:val="4"/>
-        </w:numPr>
-        <w:keepNext w:val="0"/>
-        <w:widowControl/>
-        <w:spacing w:before="0" w:after="70" w:line="252" w:lineRule="auto"/>
+        <w:keepNext/>
+        <w:widowControl/>
+        <w:spacing w:before="60" w:after="60" w:line="252" w:lineRule="auto"/>
+      </w:pPr>
+      <w:r>
+        <w:rPr>
+          <w:rFonts w:ascii="Times New Roman" w:hAnsi="Times New Roman"/>
+          <w:b/>
+          <w:color w:val="000000"/>
+          <w:sz w:val="19"/>
+        </w:rPr>
+        <w:t>RESEARCH AND SIMULATION</w:t>
+      </w:r>
+    </w:p>
+    <w:p>
+      <w:pPr>
+        <w:numPr>
+          <w:ilvl w:val="0"/>
+          <w:numId w:val="4"/>
+        </w:numPr>
+        <w:keepNext w:val="0"/>
+        <w:widowControl/>
+        <w:spacing w:before="0" w:after="80" w:line="252" w:lineRule="auto"/>
         <w:ind w:left="360" w:hanging="360"/>
         <w:jc w:val="left"/>
       </w:pPr>
@@ -576,7 +714,7 @@
         </w:numPr>
         <w:keepNext w:val="0"/>
         <w:widowControl/>
-        <w:spacing w:before="0" w:after="70" w:line="252" w:lineRule="auto"/>
+        <w:spacing w:before="0" w:after="80" w:line="252" w:lineRule="auto"/>
         <w:ind w:left="360" w:hanging="360"/>
         <w:jc w:val="left"/>
       </w:pPr>
@@ -597,7 +735,7 @@
         </w:numPr>
         <w:keepNext w:val="0"/>
         <w:widowControl/>
-        <w:spacing w:before="0" w:after="70" w:line="252" w:lineRule="auto"/>
+        <w:spacing w:before="0" w:after="80" w:line="252" w:lineRule="auto"/>
         <w:ind w:left="360" w:hanging="360"/>
         <w:jc w:val="left"/>
       </w:pPr>
@@ -613,7 +751,7 @@
     <w:p>
       <w:pPr>
         <w:keepNext/>
-        <w:spacing w:before="180" w:after="100" w:line="252" w:lineRule="auto"/>
+        <w:spacing w:before="280" w:after="140" w:line="252" w:lineRule="auto"/>
       </w:pPr>
       <w:r>
         <w:rPr>
@@ -623,7 +761,7 @@
           <w:sz w:val="23"/>
           <w:u w:val="single"/>
         </w:rPr>
-        <w:t>SELECTED AI AND DATA PRODUCTS</w:t>
+        <w:t>SELECTED INTERNAL PRODUCTS</w:t>
       </w:r>
     </w:p>
     <w:p>
@@ -633,7 +771,7 @@
         <w:tabs>
           <w:tab w:pos="10296" w:val="right"/>
         </w:tabs>
-        <w:spacing w:before="0" w:after="40" w:line="252" w:lineRule="auto"/>
+        <w:spacing w:before="40" w:after="60" w:line="252" w:lineRule="auto"/>
       </w:pPr>
       <w:r>
         <w:rPr>
@@ -685,7 +823,7 @@
         <w:tabs>
           <w:tab w:pos="10296" w:val="right"/>
         </w:tabs>
-        <w:spacing w:before="0" w:after="40" w:line="252" w:lineRule="auto"/>
+        <w:spacing w:before="140" w:after="60" w:line="252" w:lineRule="auto"/>
       </w:pPr>
       <w:r>
         <w:rPr>
@@ -733,111 +871,7 @@
     <w:p>
       <w:pPr>
         <w:keepNext/>
-        <w:widowControl/>
-        <w:tabs>
-          <w:tab w:pos="10296" w:val="right"/>
-        </w:tabs>
-        <w:spacing w:before="0" w:after="40" w:line="252" w:lineRule="auto"/>
-      </w:pPr>
-      <w:r>
-        <w:rPr>
-          <w:rFonts w:ascii="Times New Roman" w:hAnsi="Times New Roman"/>
-          <w:b/>
-          <w:color w:val="000000"/>
-          <w:sz w:val="22"/>
-        </w:rPr>
-        <w:t>AI talent matching</w:t>
-      </w:r>
-      <w:r>
-        <w:tab/>
-      </w:r>
-      <w:r>
-        <w:rPr>
-          <w:rFonts w:ascii="Times New Roman" w:hAnsi="Times New Roman"/>
-          <w:b/>
-          <w:color w:val="000000"/>
-          <w:sz w:val="22"/>
-        </w:rPr>
-        <w:t>UAT  |  Internal</w:t>
-      </w:r>
-    </w:p>
-    <w:p>
-      <w:pPr>
-        <w:numPr>
-          <w:ilvl w:val="0"/>
-          <w:numId w:val="4"/>
-        </w:numPr>
-        <w:keepNext w:val="0"/>
-        <w:widowControl/>
-        <w:spacing w:before="0" w:after="70" w:line="252" w:lineRule="auto"/>
-        <w:ind w:left="360" w:hanging="360"/>
-        <w:jc w:val="left"/>
-      </w:pPr>
-      <w:r>
-        <w:rPr>
-          <w:rFonts w:ascii="Times New Roman" w:hAnsi="Times New Roman"/>
-          <w:color w:val="000000"/>
-          <w:sz w:val="22"/>
-        </w:rPr>
-        <w:t>Pairs vector similarity with governed identity and role data so recommendations remain explainable and grounded in trusted records.</w:t>
-      </w:r>
-    </w:p>
-    <w:p>
-      <w:pPr>
-        <w:keepNext/>
-        <w:widowControl/>
-        <w:tabs>
-          <w:tab w:pos="10296" w:val="right"/>
-        </w:tabs>
-        <w:spacing w:before="0" w:after="40" w:line="252" w:lineRule="auto"/>
-      </w:pPr>
-      <w:r>
-        <w:rPr>
-          <w:rFonts w:ascii="Times New Roman" w:hAnsi="Times New Roman"/>
-          <w:b/>
-          <w:color w:val="000000"/>
-          <w:sz w:val="22"/>
-        </w:rPr>
-        <w:t>Operational analytics platform</w:t>
-      </w:r>
-      <w:r>
-        <w:tab/>
-      </w:r>
-      <w:r>
-        <w:rPr>
-          <w:rFonts w:ascii="Times New Roman" w:hAnsi="Times New Roman"/>
-          <w:b/>
-          <w:color w:val="000000"/>
-          <w:sz w:val="22"/>
-        </w:rPr>
-        <w:t>UAT  |  Internal</w:t>
-      </w:r>
-    </w:p>
-    <w:p>
-      <w:pPr>
-        <w:numPr>
-          <w:ilvl w:val="0"/>
-          <w:numId w:val="4"/>
-        </w:numPr>
-        <w:keepNext w:val="0"/>
-        <w:widowControl/>
-        <w:spacing w:before="0" w:after="70" w:line="252" w:lineRule="auto"/>
-        <w:ind w:left="360" w:hanging="360"/>
-        <w:jc w:val="left"/>
-      </w:pPr>
-      <w:r>
-        <w:rPr>
-          <w:rFonts w:ascii="Times New Roman" w:hAnsi="Times New Roman"/>
-          <w:color w:val="000000"/>
-          <w:sz w:val="22"/>
-        </w:rPr>
-        <w:t>Combines streaming data, anomaly detection, drill-down analysis, and audit trails with freshness checks, lineage, and reproducible transformations.</w:t>
-      </w:r>
-    </w:p>
-    <w:p>
-      <w:pPr>
-        <w:keepNext/>
-        <w:spacing w:before="180" w:after="100" w:line="252" w:lineRule="auto"/>
+        <w:spacing w:before="280" w:after="140" w:line="252" w:lineRule="auto"/>
       </w:pPr>
       <w:r>
         <w:rPr>
@@ -916,7 +950,7 @@
     <w:p>
       <w:pPr>
         <w:keepNext/>
-        <w:spacing w:before="180" w:after="100" w:line="252" w:lineRule="auto"/>
+        <w:spacing w:before="280" w:after="140" w:line="252" w:lineRule="auto"/>
       </w:pPr>
       <w:r>
         <w:rPr>

</xml_diff>

<commit_message>
Refresh profile and simplify resume details
</commit_message>
<xml_diff>
--- a/public/Kerk_Zhi_Sheng_Resume.docx
+++ b/public/Kerk_Zhi_Sheng_Resume.docx
@@ -160,37 +160,84 @@
         <w:t>EDUCATION</w:t>
       </w:r>
     </w:p>
-    <w:p>
-      <w:pPr>
-        <w:keepNext/>
-        <w:widowControl/>
-        <w:tabs>
-          <w:tab w:pos="10296" w:val="right"/>
-        </w:tabs>
-        <w:spacing w:before="140" w:after="60" w:line="252" w:lineRule="auto"/>
-      </w:pPr>
-      <w:r>
-        <w:rPr>
-          <w:rFonts w:ascii="Times New Roman" w:hAnsi="Times New Roman"/>
-          <w:b/>
-          <w:color w:val="000000"/>
-          <w:sz w:val="22"/>
-        </w:rPr>
-        <w:t>National University of Singapore (NUS)</w:t>
-      </w:r>
-      <w:r>
-        <w:tab/>
-      </w:r>
-      <w:r>
-        <w:rPr>
-          <w:rFonts w:ascii="Times New Roman" w:hAnsi="Times New Roman"/>
-          <w:b/>
-          <w:color w:val="000000"/>
-          <w:sz w:val="22"/>
-        </w:rPr>
-        <w:t>Aug 2018 to May 2022</w:t>
-      </w:r>
-    </w:p>
+    <w:tbl>
+      <w:tblPr>
+        <w:tblW w:type="auto" w:w="0"/>
+        <w:tblLayout w:type="fixed"/>
+        <w:tblLook w:firstColumn="1" w:firstRow="1" w:lastColumn="0" w:lastRow="0" w:noHBand="0" w:noVBand="1" w:val="04A0"/>
+        <w:tblBorders>
+          <w:top w:val="nil"/>
+          <w:left w:val="nil"/>
+          <w:bottom w:val="nil"/>
+          <w:right w:val="nil"/>
+          <w:insideH w:val="nil"/>
+          <w:insideV w:val="nil"/>
+        </w:tblBorders>
+      </w:tblPr>
+      <w:tblGrid>
+        <w:gridCol w:w="7848"/>
+        <w:gridCol w:w="2621"/>
+      </w:tblGrid>
+      <w:tr>
+        <w:tc>
+          <w:tcPr>
+            <w:tcW w:type="dxa" w:w="5233"/>
+            <w:tcMar>
+              <w:top w:w="0" w:type="dxa"/>
+              <w:left w:w="0" w:type="dxa"/>
+              <w:bottom w:w="0" w:type="dxa"/>
+              <w:right w:w="0" w:type="dxa"/>
+            </w:tcMar>
+            <w:vAlign w:val="bottom"/>
+          </w:tcPr>
+          <w:p>
+            <w:pPr>
+              <w:keepNext/>
+              <w:widowControl/>
+              <w:spacing w:before="140" w:after="60" w:line="252" w:lineRule="auto"/>
+            </w:pPr>
+            <w:r>
+              <w:rPr>
+                <w:rFonts w:ascii="Times New Roman" w:hAnsi="Times New Roman"/>
+                <w:b/>
+                <w:color w:val="000000"/>
+                <w:sz w:val="22"/>
+              </w:rPr>
+              <w:t>National University of Singapore (NUS)</w:t>
+            </w:r>
+          </w:p>
+        </w:tc>
+        <w:tc>
+          <w:tcPr>
+            <w:tcW w:type="dxa" w:w="5233"/>
+            <w:tcMar>
+              <w:top w:w="0" w:type="dxa"/>
+              <w:left w:w="0" w:type="dxa"/>
+              <w:bottom w:w="0" w:type="dxa"/>
+              <w:right w:w="0" w:type="dxa"/>
+            </w:tcMar>
+            <w:vAlign w:val="bottom"/>
+          </w:tcPr>
+          <w:p>
+            <w:pPr>
+              <w:keepNext/>
+              <w:widowControl/>
+              <w:spacing w:before="140" w:after="60" w:line="252" w:lineRule="auto"/>
+              <w:jc w:val="right"/>
+            </w:pPr>
+            <w:r>
+              <w:rPr>
+                <w:rFonts w:ascii="Times New Roman" w:hAnsi="Times New Roman"/>
+                <w:b/>
+                <w:color w:val="000000"/>
+                <w:sz w:val="22"/>
+              </w:rPr>
+              <w:t>Aug 2018 to May 2022</w:t>
+            </w:r>
+          </w:p>
+        </w:tc>
+      </w:tr>
+    </w:tbl>
     <w:p>
       <w:pPr>
         <w:numPr>
@@ -228,37 +275,84 @@
         <w:t>PROFESSIONAL EXPERIENCE</w:t>
       </w:r>
     </w:p>
-    <w:p>
-      <w:pPr>
-        <w:keepNext/>
-        <w:widowControl/>
-        <w:tabs>
-          <w:tab w:pos="10296" w:val="right"/>
-        </w:tabs>
-        <w:spacing w:before="40" w:after="60" w:line="252" w:lineRule="auto"/>
-      </w:pPr>
-      <w:r>
-        <w:rPr>
-          <w:rFonts w:ascii="Times New Roman" w:hAnsi="Times New Roman"/>
-          <w:b/>
-          <w:color w:val="000000"/>
-          <w:sz w:val="22"/>
-        </w:rPr>
-        <w:t>GovTech  |  Data and AI Engineer</w:t>
-      </w:r>
-      <w:r>
-        <w:tab/>
-      </w:r>
-      <w:r>
-        <w:rPr>
-          <w:rFonts w:ascii="Times New Roman" w:hAnsi="Times New Roman"/>
-          <w:b/>
-          <w:color w:val="000000"/>
-          <w:sz w:val="22"/>
-        </w:rPr>
-        <w:t>2024 to Present</w:t>
-      </w:r>
-    </w:p>
+    <w:tbl>
+      <w:tblPr>
+        <w:tblW w:type="auto" w:w="0"/>
+        <w:tblLayout w:type="fixed"/>
+        <w:tblLook w:firstColumn="1" w:firstRow="1" w:lastColumn="0" w:lastRow="0" w:noHBand="0" w:noVBand="1" w:val="04A0"/>
+        <w:tblBorders>
+          <w:top w:val="nil"/>
+          <w:left w:val="nil"/>
+          <w:bottom w:val="nil"/>
+          <w:right w:val="nil"/>
+          <w:insideH w:val="nil"/>
+          <w:insideV w:val="nil"/>
+        </w:tblBorders>
+      </w:tblPr>
+      <w:tblGrid>
+        <w:gridCol w:w="7848"/>
+        <w:gridCol w:w="2621"/>
+      </w:tblGrid>
+      <w:tr>
+        <w:tc>
+          <w:tcPr>
+            <w:tcW w:type="dxa" w:w="5233"/>
+            <w:tcMar>
+              <w:top w:w="0" w:type="dxa"/>
+              <w:left w:w="0" w:type="dxa"/>
+              <w:bottom w:w="0" w:type="dxa"/>
+              <w:right w:w="0" w:type="dxa"/>
+            </w:tcMar>
+            <w:vAlign w:val="bottom"/>
+          </w:tcPr>
+          <w:p>
+            <w:pPr>
+              <w:keepNext/>
+              <w:widowControl/>
+              <w:spacing w:before="40" w:after="60" w:line="252" w:lineRule="auto"/>
+            </w:pPr>
+            <w:r>
+              <w:rPr>
+                <w:rFonts w:ascii="Times New Roman" w:hAnsi="Times New Roman"/>
+                <w:b/>
+                <w:color w:val="000000"/>
+                <w:sz w:val="22"/>
+              </w:rPr>
+              <w:t>GovTech  |  Data and AI Engineer</w:t>
+            </w:r>
+          </w:p>
+        </w:tc>
+        <w:tc>
+          <w:tcPr>
+            <w:tcW w:type="dxa" w:w="5233"/>
+            <w:tcMar>
+              <w:top w:w="0" w:type="dxa"/>
+              <w:left w:w="0" w:type="dxa"/>
+              <w:bottom w:w="0" w:type="dxa"/>
+              <w:right w:w="0" w:type="dxa"/>
+            </w:tcMar>
+            <w:vAlign w:val="bottom"/>
+          </w:tcPr>
+          <w:p>
+            <w:pPr>
+              <w:keepNext/>
+              <w:widowControl/>
+              <w:spacing w:before="40" w:after="60" w:line="252" w:lineRule="auto"/>
+              <w:jc w:val="right"/>
+            </w:pPr>
+            <w:r>
+              <w:rPr>
+                <w:rFonts w:ascii="Times New Roman" w:hAnsi="Times New Roman"/>
+                <w:b/>
+                <w:color w:val="000000"/>
+                <w:sz w:val="22"/>
+              </w:rPr>
+              <w:t>2024 to Present</w:t>
+            </w:r>
+          </w:p>
+        </w:tc>
+      </w:tr>
+    </w:tbl>
     <w:p>
       <w:pPr>
         <w:keepNext w:val="0"/>
@@ -470,37 +564,84 @@
         <w:t>Presented an internal Databricks brown-bag session on Genie agents and Genie Code, and participated in internal forums and hackathons to share practical AI adoption patterns.</w:t>
       </w:r>
     </w:p>
-    <w:p>
-      <w:pPr>
-        <w:keepNext/>
-        <w:widowControl/>
-        <w:tabs>
-          <w:tab w:pos="10296" w:val="right"/>
-        </w:tabs>
-        <w:spacing w:before="220" w:after="60" w:line="252" w:lineRule="auto"/>
-      </w:pPr>
-      <w:r>
-        <w:rPr>
-          <w:rFonts w:ascii="Times New Roman" w:hAnsi="Times New Roman"/>
-          <w:b/>
-          <w:color w:val="000000"/>
-          <w:sz w:val="22"/>
-        </w:rPr>
-        <w:t>Micron Technology  |  Data Science Engineer</w:t>
-      </w:r>
-      <w:r>
-        <w:tab/>
-      </w:r>
-      <w:r>
-        <w:rPr>
-          <w:rFonts w:ascii="Times New Roman" w:hAnsi="Times New Roman"/>
-          <w:b/>
-          <w:color w:val="000000"/>
-          <w:sz w:val="22"/>
-        </w:rPr>
-        <w:t>Jun 2022 to 2025</w:t>
-      </w:r>
-    </w:p>
+    <w:tbl>
+      <w:tblPr>
+        <w:tblW w:type="auto" w:w="0"/>
+        <w:tblLayout w:type="fixed"/>
+        <w:tblLook w:firstColumn="1" w:firstRow="1" w:lastColumn="0" w:lastRow="0" w:noHBand="0" w:noVBand="1" w:val="04A0"/>
+        <w:tblBorders>
+          <w:top w:val="nil"/>
+          <w:left w:val="nil"/>
+          <w:bottom w:val="nil"/>
+          <w:right w:val="nil"/>
+          <w:insideH w:val="nil"/>
+          <w:insideV w:val="nil"/>
+        </w:tblBorders>
+      </w:tblPr>
+      <w:tblGrid>
+        <w:gridCol w:w="7848"/>
+        <w:gridCol w:w="2621"/>
+      </w:tblGrid>
+      <w:tr>
+        <w:tc>
+          <w:tcPr>
+            <w:tcW w:type="dxa" w:w="5233"/>
+            <w:tcMar>
+              <w:top w:w="0" w:type="dxa"/>
+              <w:left w:w="0" w:type="dxa"/>
+              <w:bottom w:w="0" w:type="dxa"/>
+              <w:right w:w="0" w:type="dxa"/>
+            </w:tcMar>
+            <w:vAlign w:val="bottom"/>
+          </w:tcPr>
+          <w:p>
+            <w:pPr>
+              <w:keepNext/>
+              <w:widowControl/>
+              <w:spacing w:before="220" w:after="60" w:line="252" w:lineRule="auto"/>
+            </w:pPr>
+            <w:r>
+              <w:rPr>
+                <w:rFonts w:ascii="Times New Roman" w:hAnsi="Times New Roman"/>
+                <w:b/>
+                <w:color w:val="000000"/>
+                <w:sz w:val="22"/>
+              </w:rPr>
+              <w:t>Micron Technology  |  Data Science Engineer</w:t>
+            </w:r>
+          </w:p>
+        </w:tc>
+        <w:tc>
+          <w:tcPr>
+            <w:tcW w:type="dxa" w:w="5233"/>
+            <w:tcMar>
+              <w:top w:w="0" w:type="dxa"/>
+              <w:left w:w="0" w:type="dxa"/>
+              <w:bottom w:w="0" w:type="dxa"/>
+              <w:right w:w="0" w:type="dxa"/>
+            </w:tcMar>
+            <w:vAlign w:val="bottom"/>
+          </w:tcPr>
+          <w:p>
+            <w:pPr>
+              <w:keepNext/>
+              <w:widowControl/>
+              <w:spacing w:before="220" w:after="60" w:line="252" w:lineRule="auto"/>
+              <w:jc w:val="right"/>
+            </w:pPr>
+            <w:r>
+              <w:rPr>
+                <w:rFonts w:ascii="Times New Roman" w:hAnsi="Times New Roman"/>
+                <w:b/>
+                <w:color w:val="000000"/>
+                <w:sz w:val="22"/>
+              </w:rPr>
+              <w:t>Jun 2022 to 2025</w:t>
+            </w:r>
+          </w:p>
+        </w:tc>
+      </w:tr>
+    </w:tbl>
     <w:p>
       <w:pPr>
         <w:keepNext/>
@@ -638,37 +779,84 @@
         <w:t>Scaled product-assembly re-entrance reporting across product groups, contributing a further 20 hours of weekly time savings.</w:t>
       </w:r>
     </w:p>
-    <w:p>
-      <w:pPr>
-        <w:keepNext/>
-        <w:widowControl/>
-        <w:tabs>
-          <w:tab w:pos="10296" w:val="right"/>
-        </w:tabs>
-        <w:spacing w:before="220" w:after="60" w:line="252" w:lineRule="auto"/>
-      </w:pPr>
-      <w:r>
-        <w:rPr>
-          <w:rFonts w:ascii="Times New Roman" w:hAnsi="Times New Roman"/>
-          <w:b/>
-          <w:color w:val="000000"/>
-          <w:sz w:val="22"/>
-        </w:rPr>
-        <w:t>National University of Singapore  |  Research Intern</w:t>
-      </w:r>
-      <w:r>
-        <w:tab/>
-      </w:r>
-      <w:r>
-        <w:rPr>
-          <w:rFonts w:ascii="Times New Roman" w:hAnsi="Times New Roman"/>
-          <w:b/>
-          <w:color w:val="000000"/>
-          <w:sz w:val="22"/>
-        </w:rPr>
-        <w:t>May to Aug 2021</w:t>
-      </w:r>
-    </w:p>
+    <w:tbl>
+      <w:tblPr>
+        <w:tblW w:type="auto" w:w="0"/>
+        <w:tblLayout w:type="fixed"/>
+        <w:tblLook w:firstColumn="1" w:firstRow="1" w:lastColumn="0" w:lastRow="0" w:noHBand="0" w:noVBand="1" w:val="04A0"/>
+        <w:tblBorders>
+          <w:top w:val="nil"/>
+          <w:left w:val="nil"/>
+          <w:bottom w:val="nil"/>
+          <w:right w:val="nil"/>
+          <w:insideH w:val="nil"/>
+          <w:insideV w:val="nil"/>
+        </w:tblBorders>
+      </w:tblPr>
+      <w:tblGrid>
+        <w:gridCol w:w="7848"/>
+        <w:gridCol w:w="2621"/>
+      </w:tblGrid>
+      <w:tr>
+        <w:tc>
+          <w:tcPr>
+            <w:tcW w:type="dxa" w:w="5233"/>
+            <w:tcMar>
+              <w:top w:w="0" w:type="dxa"/>
+              <w:left w:w="0" w:type="dxa"/>
+              <w:bottom w:w="0" w:type="dxa"/>
+              <w:right w:w="0" w:type="dxa"/>
+            </w:tcMar>
+            <w:vAlign w:val="bottom"/>
+          </w:tcPr>
+          <w:p>
+            <w:pPr>
+              <w:keepNext/>
+              <w:widowControl/>
+              <w:spacing w:before="220" w:after="60" w:line="252" w:lineRule="auto"/>
+            </w:pPr>
+            <w:r>
+              <w:rPr>
+                <w:rFonts w:ascii="Times New Roman" w:hAnsi="Times New Roman"/>
+                <w:b/>
+                <w:color w:val="000000"/>
+                <w:sz w:val="22"/>
+              </w:rPr>
+              <w:t>National University of Singapore  |  Research Intern</w:t>
+            </w:r>
+          </w:p>
+        </w:tc>
+        <w:tc>
+          <w:tcPr>
+            <w:tcW w:type="dxa" w:w="5233"/>
+            <w:tcMar>
+              <w:top w:w="0" w:type="dxa"/>
+              <w:left w:w="0" w:type="dxa"/>
+              <w:bottom w:w="0" w:type="dxa"/>
+              <w:right w:w="0" w:type="dxa"/>
+            </w:tcMar>
+            <w:vAlign w:val="bottom"/>
+          </w:tcPr>
+          <w:p>
+            <w:pPr>
+              <w:keepNext/>
+              <w:widowControl/>
+              <w:spacing w:before="220" w:after="60" w:line="252" w:lineRule="auto"/>
+              <w:jc w:val="right"/>
+            </w:pPr>
+            <w:r>
+              <w:rPr>
+                <w:rFonts w:ascii="Times New Roman" w:hAnsi="Times New Roman"/>
+                <w:b/>
+                <w:color w:val="000000"/>
+                <w:sz w:val="22"/>
+              </w:rPr>
+              <w:t>May to Aug 2021</w:t>
+            </w:r>
+          </w:p>
+        </w:tc>
+      </w:tr>
+    </w:tbl>
     <w:p>
       <w:pPr>
         <w:keepNext/>
@@ -768,9 +956,6 @@
       <w:pPr>
         <w:keepNext/>
         <w:widowControl/>
-        <w:tabs>
-          <w:tab w:pos="10296" w:val="right"/>
-        </w:tabs>
         <w:spacing w:before="40" w:after="60" w:line="252" w:lineRule="auto"/>
       </w:pPr>
       <w:r>
@@ -781,18 +966,6 @@
           <w:sz w:val="22"/>
         </w:rPr>
         <w:t>Multi-agent triage platform</w:t>
-      </w:r>
-      <w:r>
-        <w:tab/>
-      </w:r>
-      <w:r>
-        <w:rPr>
-          <w:rFonts w:ascii="Times New Roman" w:hAnsi="Times New Roman"/>
-          <w:b/>
-          <w:color w:val="000000"/>
-          <w:sz w:val="22"/>
-        </w:rPr>
-        <w:t>Production  |  Internal</w:t>
       </w:r>
     </w:p>
     <w:p>
@@ -820,9 +993,6 @@
       <w:pPr>
         <w:keepNext/>
         <w:widowControl/>
-        <w:tabs>
-          <w:tab w:pos="10296" w:val="right"/>
-        </w:tabs>
         <w:spacing w:before="140" w:after="60" w:line="252" w:lineRule="auto"/>
       </w:pPr>
       <w:r>
@@ -833,18 +1003,6 @@
           <w:sz w:val="22"/>
         </w:rPr>
         <w:t>AI workspace platform</w:t>
-      </w:r>
-      <w:r>
-        <w:tab/>
-      </w:r>
-      <w:r>
-        <w:rPr>
-          <w:rFonts w:ascii="Times New Roman" w:hAnsi="Times New Roman"/>
-          <w:b/>
-          <w:color w:val="000000"/>
-          <w:sz w:val="22"/>
-        </w:rPr>
-        <w:t>Production  |  Internal</w:t>
       </w:r>
     </w:p>
     <w:p>
@@ -902,7 +1060,7 @@
           <w:color w:val="000000"/>
           <w:sz w:val="22"/>
         </w:rPr>
-        <w:t>Databricks Certified Data Engineer Associate, Credential 166618858, valid Nov 2025 to Nov 2027</w:t>
+        <w:t>Databricks Certified Data Engineer Associate</w:t>
       </w:r>
     </w:p>
     <w:p>
@@ -923,7 +1081,7 @@
           <w:color w:val="000000"/>
           <w:sz w:val="22"/>
         </w:rPr>
-        <w:t>DART AI for Cybersecurity Practitioners, earned 31 Aug 2026</w:t>
+        <w:t>DART AI for Cybersecurity Practitioners</w:t>
       </w:r>
     </w:p>
     <w:p>
@@ -944,7 +1102,7 @@
           <w:color w:val="000000"/>
           <w:sz w:val="22"/>
         </w:rPr>
-        <w:t>AI Singapore AI for Industry® Literacy in AI, ID 32518583, earned 16 May 2021</w:t>
+        <w:t>AI Singapore AI for Industry® Literacy in AI</w:t>
       </w:r>
     </w:p>
     <w:p>

</xml_diff>